<commit_message>
feat, panel de control con logs mejorado, manual actualizadö
</commit_message>
<xml_diff>
--- a/Manual_Instalacion_y_Uso_SysEqui.docx
+++ b/Manual_Instalacion_y_Uso_SysEqui.docx
@@ -7052,6 +7052,48 @@
       <w:proofErr w:type="spellEnd"/>
       <w:r>
         <w:t>, complete primero los requisitos de las secciones 2 a 6.</w:t>
+      </w:r>
+    </w:p>
+    <w:p>
+      <w:pPr>
+        <w:pStyle w:val="Ttulo3"/>
+      </w:pPr>
+      <w:r>
+        <w:t>Registros de actividad y técnicos</w:t>
+      </w:r>
+    </w:p>
+    <w:p>
+      <w:pPr/>
+      <w:r>
+        <w:t>El Panel de Control separa los mensajes en dos pestañas para facilitar la observación del sistema:</w:t>
+      </w:r>
+    </w:p>
+    <w:p>
+      <w:pPr>
+        <w:pStyle w:val="Prrafodelista"/>
+      </w:pPr>
+      <w:r>
+        <w:t>Actividad: es la vista inicial. Muestra accesos, cierres de sesión, consultas, altas, modificaciones y errores del backend con mensajes legibles. El verde indica éxito, el amarillo una advertencia o acceso bloqueado y el rojo un error.</w:t>
+      </w:r>
+    </w:p>
+    <w:p>
+      <w:pPr>
+        <w:pStyle w:val="Prrafodelista"/>
+      </w:pPr>
+      <w:r>
+        <w:t>Técnico: conserva los mensajes de inicio, puertos, Docker, MongoDB, frontend, backend y advertencias internas. Utilice esta pestaña para diagnosticar problemas de ejecución.</w:t>
+      </w:r>
+    </w:p>
+    <w:p>
+      <w:pPr/>
+      <w:r>
+        <w:t>La pestaña Actividad conserva hasta 100 eventos recientes mientras el panel está abierto. Los eventos también se guardan en %LOCALAPPDATA%\SysEqui\ControlNodeLogs\activity.log. Los registros técnicos continúan en backend.log, frontend.log y control.log.</w:t>
+      </w:r>
+    </w:p>
+    <w:p>
+      <w:pPr/>
+      <w:r>
+        <w:t>Privacidad: la actividad puede mostrar nombre, rol y DNI, pero nunca almacena contraseñas, tokens, cookies, correos ni teléfonos. El panel debe ser utilizado solamente por personal autorizado.</w:t>
       </w:r>
     </w:p>
     <w:p>

</xml_diff>